<commit_message>
docs: auditar y cerrar paquete entregable
</commit_message>
<xml_diff>
--- a/Entregables_pt_app/02_funciones_usadas/documentacion_funciones.docx
+++ b/Entregables_pt_app/02_funciones_usadas/documentacion_funciones.docx
@@ -2,7 +2,7 @@
 <file path=word/document.xml><?xml version="1.0" encoding="utf-8"?>
 <w:document xmlns:w="http://schemas.openxmlformats.org/wordprocessingml/2006/main" xmlns:m="http://schemas.openxmlformats.org/officeDocument/2006/math" xmlns:r="http://schemas.openxmlformats.org/officeDocument/2006/relationships" xmlns:o="urn:schemas-microsoft-com:office:office" xmlns:v="urn:schemas-microsoft-com:vml" xmlns:w10="urn:schemas-microsoft-com:office:word" xmlns:a="http://schemas.openxmlformats.org/drawingml/2006/main" xmlns:pic="http://schemas.openxmlformats.org/drawingml/2006/picture" xmlns:wp="http://schemas.openxmlformats.org/drawingml/2006/wordprocessingDrawing">
   <w:body>
-    <w:bookmarkStart w:id="100" w:name="documentacion-de-funciones"/>
+    <w:bookmarkStart w:id="101" w:name="documentacion-de-funciones"/>
     <w:p>
       <w:pPr>
         <w:pStyle w:val="Heading1"/>
@@ -14930,16 +14930,67 @@
       </w:r>
     </w:p>
     <w:p>
-      <w:pPr>
-        <w:pStyle w:val="BodyText"/>
-      </w:pPr>
-      <w:r>
-        <w:t xml:space="preserve">—n</w:t>
+      <w:r>
+        <w:pict>
+          <v:rect style="width:0;height:1.5pt" o:hralign="center" o:hrstd="t" o:hr="t"/>
+        </w:pict>
       </w:r>
     </w:p>
     <w:bookmarkEnd w:id="98"/>
     <w:bookmarkEnd w:id="99"/>
+    <w:bookmarkStart w:id="100" w:name="evidencia-visual"/>
+    <w:p>
+      <w:pPr>
+        <w:pStyle w:val="Heading2"/>
+      </w:pPr>
+      <w:r>
+        <w:t xml:space="preserve">Evidencia visual</w:t>
+      </w:r>
+    </w:p>
+    <w:p>
+      <w:pPr>
+        <w:pStyle w:val="FirstParagraph"/>
+      </w:pPr>
+      <w:r>
+        <w:t xml:space="preserve">La ejecución del Algoritmo A documentado en este catálogo se observa en</w:t>
+      </w:r>
+      <w:r>
+        <w:t xml:space="preserve"> </w:t>
+      </w:r>
+      <w:r>
+        <w:rPr>
+          <w:b/>
+          <w:bCs/>
+        </w:rPr>
+        <w:t xml:space="preserve">CAP-09</w:t>
+      </w:r>
+      <w:r>
+        <w:t xml:space="preserve">. Consulte</w:t>
+      </w:r>
+      <w:r>
+        <w:t xml:space="preserve"> </w:t>
+      </w:r>
+      <w:r>
+        <w:rPr>
+          <w:rStyle w:val="VerbatimChar"/>
+        </w:rPr>
+        <w:t xml:space="preserve">../../00_evidencia_visual/indice_capturas.md</w:t>
+      </w:r>
+      <w:r>
+        <w:t xml:space="preserve"> </w:t>
+      </w:r>
+      <w:r>
+        <w:t xml:space="preserve">para acción</w:t>
+      </w:r>
+      <w:r>
+        <w:t xml:space="preserve"> </w:t>
+      </w:r>
+      <w:r>
+        <w:t xml:space="preserve">previa, datos, commit, resolución y SHA-256.</w:t>
+      </w:r>
+    </w:p>
     <w:bookmarkEnd w:id="100"/>
+    <w:bookmarkEnd w:id="101"/>
     <w:sectPr>
       <w:footnotePr>
         <w:numRestart w:val="eachSect"/>

</xml_diff>